<commit_message>
Simplify video submission document
</commit_message>
<xml_diff>
--- a/Video_Submission_Summary_Balamurali_Konathala.docx
+++ b/Video_Submission_Summary_Balamurali_Konathala.docx
@@ -35,11 +35,6 @@
     <w:p>
       <w:r>
         <w:t>https://youtu.be/HpIUUl5BNd0</w:t>
-      </w:r>
-    </w:p>
-    <w:p>
-      <w:r>
-        <w:t>The video should be set to Unlisted or another setting that allows the instructor and Learning Facilitator to view it.</w:t>
       </w:r>
     </w:p>
     <w:p>

</xml_diff>